<commit_message>
Clarify observed versions, ordinary processing delay and synchronization
</commit_message>
<xml_diff>
--- a/ImageLab_Assessment_2_Daryn_Forman.docx
+++ b/ImageLab_Assessment_2_Daryn_Forman.docx
@@ -114,13 +114,9 @@
       </w:r>
     </w:p>
     <w:p>
-      <w:r>
-        <w:br w:type="page"/>
-      </w:r>
-    </w:p>
-    <w:p>
       <w:pPr>
         <w:pStyle w:val="Heading1"/>
+        <w:pageBreakBefore/>
       </w:pPr>
       <w:r>
         <w:t>3  Measured results</w:t>
@@ -987,7 +983,7 @@
       <w:r>
         <w:drawing>
           <wp:inline xmlns:a="http://schemas.openxmlformats.org/drawingml/2006/main" xmlns:pic="http://schemas.openxmlformats.org/drawingml/2006/picture">
-            <wp:extent cx="5733288" cy="1938528"/>
+            <wp:extent cx="5733288" cy="1847088"/>
             <wp:docPr id="1" name="Picture 1"/>
             <wp:cNvGraphicFramePr>
               <a:graphicFrameLocks noChangeAspect="1"/>
@@ -1008,7 +1004,7 @@
                   <pic:spPr>
                     <a:xfrm>
                       <a:off x="0" y="0"/>
-                      <a:ext cx="5733288" cy="1938528"/>
+                      <a:ext cx="5733288" cy="1847088"/>
                     </a:xfrm>
                     <a:prstGeom prst="rect"/>
                   </pic:spPr>
@@ -1035,7 +1031,7 @@
       <w:r>
         <w:drawing>
           <wp:inline xmlns:a="http://schemas.openxmlformats.org/drawingml/2006/main" xmlns:pic="http://schemas.openxmlformats.org/drawingml/2006/picture">
-            <wp:extent cx="5733288" cy="1938528"/>
+            <wp:extent cx="5733288" cy="1847088"/>
             <wp:docPr id="2" name="Picture 2"/>
             <wp:cNvGraphicFramePr>
               <a:graphicFrameLocks noChangeAspect="1"/>
@@ -1056,7 +1052,7 @@
                   <pic:spPr>
                     <a:xfrm>
                       <a:off x="0" y="0"/>
-                      <a:ext cx="5733288" cy="1938528"/>
+                      <a:ext cx="5733288" cy="1847088"/>
                     </a:xfrm>
                     <a:prstGeom prst="rect"/>
                   </pic:spPr>
@@ -1077,17 +1073,13 @@
     </w:p>
     <w:p>
       <w:r>
-        <w:t>All 30 measured runs reached completed with three variant records; no observation errors, cancellations or pending requests remained. The separate runs.csv contains every required per-run metric. Supporting client/server logs, snapshots and summaries retain received/committed versions, gaps and timing evidence. One incomplete recorder setup attempt is outside this measured series.</w:t>
-      </w:r>
-    </w:p>
-    <w:p>
-      <w:r>
-        <w:br w:type="page"/>
+        <w:t>Version coverage — median (minimum–maximum) distinct versions received after baseline: C2 short 11 (11–11), long 54 (54–55); C3 short 9 (8–9), long 43 (41–44). Missing committed versions: C2 short 44 (44–44), long 1 (0–1); C3 short 46 (45–46), long 12 (11–14). C2 baselines were 1; C3 short baselines were 2, 1, 2 and long baselines were 1. All terminal versions were 56. All 30 runs recorded completion, three variants and zero observation errors, cancellations or pending requests. Full metrics remain in runs.csv; the incomplete setup attempt is excluded.</w:t>
       </w:r>
     </w:p>
     <w:p>
       <w:pPr>
         <w:pStyle w:val="Heading1"/>
+        <w:pageBreakBefore/>
       </w:pPr>
       <w:r>
         <w:t>4  Interpretation and limitations</w:t>
@@ -1095,32 +1087,37 @@
     </w:p>
     <w:p>
       <w:r>
-        <w:t>Long polling helped most during quiet work: A fell from 32 to 6 median GETs and from 693 to 13 ms median detection delay. Across the three A short runs, 86 of 95 GETs returned unchanged snapshots. C1 also used fewer long-poll GETs (10 versus 12). These results support my A and C1 request predictions.</w:t>
+        <w:t>Long polling helped during quiet work: A fell from 32 to 6 median GETs and from 693 to 13 ms median detection delay. Across A short runs, 86 of 95 GETs were unchanged. C1 also used fewer long-poll GETs (10 versus 12), supporting my A and C1 request predictions.</w:t>
       </w:r>
     </w:p>
     <w:p>
       <w:r>
-        <w:t>Long polling did not minimise requests in B, C2 or C3. B finished quickly enough for short polling to use two GETs, while long polling observed more milestones. Both modes stop at completion, so that part of my B reasoning was not unique to short polling. C2 supported my request prediction (12 versus 55 median GETs), but each response is one current snapshot, not a list of events. C3 increased both median delays relative to C2; counts fell to 10 and 44, rather than staying roughly unchanged. Longer response cycles can span several commits. Although long polling had lower median delay in all conditions, C3 repetition 3 favoured short polling: 426 versus 484 ms.</w:t>
+        <w:t>During ordinary processing in B, median completion-detection delay was 111 ms for short polling and 10 ms for long polling. Short polling used two GETs, while long polling observed more milestones. Both stop at completion, so my B explanation was not unique to short polling. C2 supported my request prediction (12 versus 55 median GETs), but responses are current snapshots, not event lists. C3 raised both median delays relative to C2; counts fell to 10 and 44, contrary to my roughly unchanged forecast. Longer response cycles span more commits, consistent with the version gaps on page 2. Long polling had lower median delay throughout, but C3 repetition 3 favoured short polling: 426 versus 484 ms.</w:t>
       </w:r>
     </w:p>
     <w:p>
       <w:r>
-        <w:t>These are observation results, not evidence that long polling accelerates image processing. The worker follows the same transformations independently. For example, B processing-duration medians were 217.594 ms (short) and 451.356 ms (long), with only three runs each. Configured waits dominate A and C1–C3; subtracting them would still leave database and scheduling time, not pure transformation time.</w:t>
+        <w:t>These results concern observation, not faster image processing: the worker performs the same transformations independently. B processing-duration medians were 217.594 ms (short) and 451.356 ms (long), with only three runs each. Subtracting configured waits in A and C1–C3 would still leave database and scheduling time, not pure transformation time.</w:t>
       </w:r>
     </w:p>
     <w:p>
       <w:r>
-        <w:t>Fewer HTTP requests need not mean fewer SQL queries. In C1, median observation reads were 13 for short polling and 20 for long polling despite fewer long-poll GETs. This handler waits on notifications, not periodic SQL polling; reads occur on entry, wake-up and deadline recheck, with additional completed-result metadata reads. A server that repeatedly queried while waiting could hide further database work. These counters exclude worker queries; held-handler memory, CPU and connection reuse were not benchmarked.</w:t>
+        <w:t>Fewer HTTP requests need not mean fewer SQL queries: C1 median observation reads were 13 (short) and 20 (long), despite fewer long-poll GETs. This handler waits on notifications, not periodic SQL polling; reads occur on entry, wake-up and deadline recheck, plus completed-result metadata reads. Counters exclude worker queries; held-handler memory, CPU and connection reuse were not measured.</w:t>
       </w:r>
     </w:p>
     <w:p>
       <w:r>
-        <w:t>The A-long-1 trace returned 204 after a 20.044-second request; the next GET started in the same receipt millisecond with after=2 unchanged. After an active 200, the browser must render, save the received version and immediately request again; after 204 it retains that version and renews. Terminal responses stop the loop. That run received versions 1, 2, 3, 4 and 6: missing version 5 did not lose the final result. If every event had to be retained, snapshots alone would be insufficient; durable event history and replay would be needed. A continuing response could instead carry separately framed updates that the browser reads incrementally, avoiding one new GET per update. This was not implemented.</w:t>
+        <w:t>Synchronization order: register each observer’s buffered signal under a mutex, then read PostgreSQL. Return if newer or terminal; otherwise wait. A commit before the read is visible there; one between reading and waiting leaves a buffered signal. The worker persists state/progress and the increased version atomically, then broadcasts only after commit. Every awakened observer rereads PostgreSQL; the signal does not prove success. The deadline also triggers a final read before 204. This order prevents the check-to-wait gap from hiding a change.</w:t>
       </w:r>
     </w:p>
     <w:p>
       <w:r>
-        <w:t>Limitations include three repetitions, one image and one computer. Millisecond timestamps, JSON parsing, logging after commit and scheduling introduce uncertainty. Firefox monitoring was enabled only for C3, adding a possible tooling confound; latency was approximate. Foreground sampling and the unsaved queue-check output limit independent verification of those controls. Successful runs do not establish every failure/lifecycle acceptance check. No broad scaling or statistical-significance claim is justified.</w:t>
+        <w:t>In A-long-1, a 204 followed a 20.044-second request; the next GET began in the same receipt millisecond with after=2 unchanged. After active 200, render, save the version and immediately request again; after 204, retain the version and renew; terminal responses stop observation. Versions 1, 2, 3, 4 and 6 arrived: missing 5 did not lose the final result. If every event mattered, durable event history and replay would be needed. A continuing response could send separately framed updates for incremental browser reading, avoiding a new GET per update; this was not implemented.</w:t>
+      </w:r>
+    </w:p>
+    <w:p>
+      <w:r>
+        <w:t>Limitations: three repetitions, one image and one computer; millisecond timestamps, JSON parsing, logging after commit and scheduling uncertainty. C3 alone enabled Firefox monitoring, a possible tooling confound, and latency was approximate. Foreground sampling and unsaved queue-check output limit independent verification. Successful runs do not establish all failure/lifecycle checks, scaling performance or statistical significance.</w:t>
       </w:r>
     </w:p>
     <w:p>

</xml_diff>